<commit_message>
actualizacion de los documentos de la configuracion de postgres
</commit_message>
<xml_diff>
--- a/Postgres/CONFIGURACION DE REPLICACION POSTGRES.docx
+++ b/Postgres/CONFIGURACION DE REPLICACION POSTGRES.docx
@@ -178,51 +178,6 @@
           <w:bCs/>
         </w:rPr>
       </w:pPr>
-      <w:proofErr w:type="spellStart"/>
-      <w:r>
-        <w:rPr>
-          <w:b/>
-          <w:bCs/>
-        </w:rPr>
-        <w:t>Copilot</w:t>
-      </w:r>
-      <w:proofErr w:type="spellEnd"/>
-      <w:r>
-        <w:rPr>
-          <w:b/>
-          <w:bCs/>
-        </w:rPr>
-        <w:t xml:space="preserve"> </w:t>
-      </w:r>
-      <w:proofErr w:type="spellStart"/>
-      <w:r>
-        <w:rPr>
-          <w:b/>
-          <w:bCs/>
-        </w:rPr>
-        <w:t>said</w:t>
-      </w:r>
-      <w:proofErr w:type="spellEnd"/>
-      <w:r>
-        <w:rPr>
-          <w:b/>
-          <w:bCs/>
-        </w:rPr>
-        <w:t>: ¡Claro! Aquí tienes un resumen conciso y</w:t>
-      </w:r>
-    </w:p>
-    <w:p>
-      <w:r>
-        <w:t>¡Claro! Aquí tienes un resumen conciso y profesional de los pasos realizados para configurar la replicación síncrona en PostgreSQL entre un servidor maestro y un servidor esclavo, listo para incluir en un informe técnico:</w:t>
-      </w:r>
-    </w:p>
-    <w:p>
-      <w:pPr>
-        <w:rPr>
-          <w:b/>
-          <w:bCs/>
-        </w:rPr>
-      </w:pPr>
       <w:r>
         <w:rPr>
           <w:b/>
@@ -522,7 +477,6 @@
         </w:numPr>
       </w:pPr>
       <w:r>
-        <w:lastRenderedPageBreak/>
         <w:t>Se borró completamente el contenido de /</w:t>
       </w:r>
       <w:proofErr w:type="spellStart"/>
@@ -586,6 +540,7 @@
     </w:p>
     <w:p>
       <w:r>
+        <w:lastRenderedPageBreak/>
         <w:t xml:space="preserve">sudo -u </w:t>
       </w:r>
       <w:proofErr w:type="spellStart"/>
@@ -847,6 +802,9 @@
         <w:ind w:left="1440"/>
       </w:pPr>
       <w:r>
+        <w:rPr>
+          <w:noProof/>
+        </w:rPr>
         <w:drawing>
           <wp:inline distT="0" distB="0" distL="0" distR="0" wp14:anchorId="23A88D1D" wp14:editId="143A507A">
             <wp:extent cx="5400040" cy="674370"/>

</xml_diff>